<commit_message>
Update - App remastered
</commit_message>
<xml_diff>
--- a/docs/legal/DARE_Nigeria_Legal_and_Licensing_Brief.docx
+++ b/docs/legal/DARE_Nigeria_Legal_and_Licensing_Brief.docx
@@ -214,12 +214,12 @@
     </w:p>
     <w:p>
       <w:r>
-        <w:t>DARE is a mobile-first social challenge platform for peer-to-peer skill challenges. A user creates a challenge, another user accepts it, both parties agree to a written rule set called a constitution, funds may be locked in escrow, the challenge runs in a live Court experience, and the result is resolved by server scoring, evidence, or a dispute review process. The product is designed around rule clarity, escrow transparency, auditability, user trust, and responsible participation.</w:t>
+        <w:t>DARE is a mobile-first social challenge platform for peer-to-peer skill challenges. A user creates a challenge, another user accepts it, required participants agree to a written rule set called a constitution, funds may be locked in escrow, the challenge runs in a live Court experience, and the result is resolved by server scoring, evidence, or a dispute review process. The product is designed around rule clarity, escrow transparency, auditability, user trust, and responsible participation.</w:t>
       </w:r>
     </w:p>
     <w:p>
       <w:r>
-        <w:t xml:space="preserve">DARE should be reviewed by counsel as a regulated-risk product. Although the commercial positioning is not a generic betting app and the intended first release prioritizes skill-based, server-scored contests, the combination of entry value, prize value, peer competition, platform fees, wallets, and payouts means counsel must classify the product under Nigerian state gaming/lottery/prize-competition laws, </w:t>
+        <w:t xml:space="preserve">DARE should be reviewed by counsel as a regulated-risk product. Although the commercial positioning is not a generic betting app and the intended first release prioritizes creator-authored Skill-Based and Task-Based DAREs with answer-key, witnessed, or evidence resolution, the combination of entry value, prize value, peer competition, platform fees, wallets, and payouts means counsel must classify the product under Nigerian state gaming/lottery/prize-competition laws, </w:t>
       </w:r>
       <w:r>
         <w:lastRenderedPageBreak/>
@@ -403,7 +403,7 @@
           </w:tcPr>
           <w:p>
             <w:r>
-              <w:t>MVP should start with algorithmic/server-scored DAREs, not physical evidence dares or honour dares with real stakes.</w:t>
+              <w:t>MVP should start with answer_key/server-scored DAREs, not physical evidence dares or evidence dares with real stakes.</w:t>
             </w:r>
           </w:p>
         </w:tc>
@@ -552,12 +552,12 @@
       </w:r>
       <w:r>
         <w:lastRenderedPageBreak/>
-        <w:t>handling. After both sides accept the constitution, the terms become immutable for that DARE unless both parties explicitly accept an amended version.</w:t>
+        <w:t>handling. After both sides accept the constitution, the terms become immutable for that DARE unless required participants explicitly accept an amended version.</w:t>
       </w:r>
     </w:p>
     <w:p>
       <w:r>
-        <w:t>The initial product should avoid open-ended physical dares and uncertain proof workflows. The safer MVP is algorithmic: for example, a quiz, timed answer round, or deterministic skill task scored by the server. Evidence-based dares, spectator-vote dares, honour dares, creator challenges, tournaments, and wider marketplace features can follow only after the licensing, wallet, dispute, and risk operations are proven.</w:t>
+        <w:t>The initial product should avoid open-ended physical dares and uncertain proof workflows. The safer MVP is answer_key: for example, a quiz, timed answer round, or deterministic skill task scored by the server. Evidence-based dares, spectator-vote dares, evidence dares, creator challenges, tournaments, and wider marketplace features can follow only after the licensing, wallet, dispute, and risk operations are proven.</w:t>
       </w:r>
     </w:p>
     <w:p>
@@ -1020,7 +1020,7 @@
         <w:pStyle w:val="ListNumber"/>
       </w:pPr>
       <w:r>
-        <w:t>Both players enter Court, ready up, and the server starts the match using server time.</w:t>
+        <w:t>Required participants enter Court, ready up, and the server starts the match using server time.</w:t>
       </w:r>
     </w:p>
     <w:p>
@@ -1232,7 +1232,7 @@
           </w:tcPr>
           <w:p>
             <w:r>
-              <w:t>DARE is available for an opponent or sent to a specific opponent.</w:t>
+              <w:t>DARE is available for an counterparty or sent to a specific counterparty.</w:t>
             </w:r>
           </w:p>
         </w:tc>
@@ -1285,7 +1285,7 @@
           </w:tcPr>
           <w:p>
             <w:r>
-              <w:t>Opponent has accepted terms.</w:t>
+              <w:t>Counterparty has accepted terms.</w:t>
             </w:r>
           </w:p>
         </w:tc>
@@ -1302,7 +1302,7 @@
           </w:tcPr>
           <w:p>
             <w:r>
-              <w:t xml:space="preserve">Both users must have accepted the </w:t>
+              <w:t xml:space="preserve">Required users must have accepted the </w:t>
             </w:r>
             <w:r>
               <w:lastRenderedPageBreak/>
@@ -1981,7 +1981,7 @@
         <w:pStyle w:val="ListNumber"/>
       </w:pPr>
       <w:r>
-        <w:t>Settlement: after result and dispute window, backend releases escrow, records winner payout, platform fee, and any juror allocation.</w:t>
+        <w:t>Settlement: after result and dispute window, backend releases escrow, records settlement payout, platform fee, and any juror allocation.</w:t>
       </w:r>
     </w:p>
     <w:p>
@@ -3274,7 +3274,7 @@
         <w:pStyle w:val="ListNumber"/>
       </w:pPr>
       <w:r>
-        <w:t>Classify the MVP algorithmic DARE product under Nigerian law for the proposed launch state.</w:t>
+        <w:t>Classify the MVP answer_key DARE product under Nigerian law for the proposed launch state.</w:t>
       </w:r>
     </w:p>
     <w:p>
@@ -3451,7 +3451,7 @@
         <w:pStyle w:val="ListBullet"/>
       </w:pPr>
       <w:r>
-        <w:t>Can DARE lawfully launch algorithmic real-money DAREs in Lagos without being licensed as betting/gaming/lottery/interactive gaming? If not, what license class applies?</w:t>
+        <w:t>Can DARE lawfully launch answer_key real-money DAREs in Lagos without being licensed as betting/gaming/lottery/interactive gaming? If not, what license class applies?</w:t>
       </w:r>
     </w:p>
     <w:p>
@@ -3615,7 +3615,7 @@
           </w:tcPr>
           <w:p>
             <w:r>
-              <w:t>Algorithmic/server-scored DAREs; wallet deposit; escrow hold; ready-up Court; server timer; result screen; settlement; dispute filing; admin queue; KYC tiering; limits; audit logs.</w:t>
+              <w:t>Answer Key/server-scored DAREs; wallet deposit; escrow hold; ready-up Court; server timer; result screen; settlement; dispute filing; admin queue; KYC tiering; limits; audit logs.</w:t>
             </w:r>
           </w:p>
         </w:tc>
@@ -3632,7 +3632,7 @@
           </w:tcPr>
           <w:p>
             <w:r>
-              <w:t>Physical dares; evidence-first dares; honour dares with real stakes; tournaments; creator economy; spectator rewards; multi-country launch; USSD production gateway; AI voice-to-DARE.</w:t>
+              <w:t>Physical dares; evidence-first dares; evidence dares with real stakes; tournaments; creator economy; spectator rewards; multi-country launch; USSD production gateway; AI voice-to-DARE.</w:t>
             </w:r>
           </w:p>
         </w:tc>
@@ -3944,7 +3944,7 @@
           </w:tcPr>
           <w:p>
             <w:r>
-              <w:t>Algorithmic DARE</w:t>
+              <w:t>Answer Key DARE</w:t>
             </w:r>
           </w:p>
         </w:tc>

</xml_diff>